<commit_message>
Exercicios de correçao 2
</commit_message>
<xml_diff>
--- a/M2-modeloAnaliseQualidade.docx
+++ b/M2-modeloAnaliseQualidade.docx
@@ -197,17 +197,7 @@
           <w:sz w:val="24"/>
           <w:szCs w:val="24"/>
         </w:rPr>
-        <w:t xml:space="preserve">Nome </w:t>
-      </w:r>
-      <w:proofErr w:type="gramStart"/>
-      <w:r>
-        <w:rPr>
-          <w:rFonts w:ascii="Arial" w:eastAsia="Arial" w:hAnsi="Arial" w:cs="Arial"/>
-          <w:color w:val="000000" w:themeColor="text1"/>
-          <w:sz w:val="24"/>
-          <w:szCs w:val="24"/>
-        </w:rPr>
-        <w:t>completo</w:t>
+        <w:t>Nome completo</w:t>
       </w:r>
       <w:r>
         <w:rPr>
@@ -225,17 +215,7 @@
           <w:sz w:val="24"/>
           <w:szCs w:val="24"/>
         </w:rPr>
-        <w:t>:</w:t>
-      </w:r>
-      <w:proofErr w:type="gramEnd"/>
-      <w:r>
-        <w:rPr>
-          <w:rFonts w:ascii="Arial" w:eastAsia="Arial" w:hAnsi="Arial" w:cs="Arial"/>
-          <w:color w:val="000000" w:themeColor="text1"/>
-          <w:sz w:val="24"/>
-          <w:szCs w:val="24"/>
-        </w:rPr>
-        <w:t xml:space="preserve"> Oseas pereira</w:t>
+        <w:t>: Oseas pereira</w:t>
       </w:r>
       <w:r>
         <w:rPr>
@@ -379,36 +359,16 @@
           <w:sz w:val="24"/>
           <w:szCs w:val="24"/>
         </w:rPr>
-        <w:t xml:space="preserve">Análise de </w:t>
-      </w:r>
-      <w:proofErr w:type="gramStart"/>
-      <w:r>
-        <w:rPr>
-          <w:rFonts w:ascii="Arial" w:eastAsia="Arial" w:hAnsi="Arial" w:cs="Arial"/>
-          <w:color w:val="000000" w:themeColor="text1"/>
-          <w:sz w:val="24"/>
-          <w:szCs w:val="24"/>
-        </w:rPr>
-        <w:t xml:space="preserve">Qualidade </w:t>
-      </w:r>
-      <w:r>
-        <w:rPr>
-          <w:rFonts w:ascii="Arial" w:eastAsia="Arial" w:hAnsi="Arial" w:cs="Arial"/>
-          <w:color w:val="000000" w:themeColor="text1"/>
-          <w:sz w:val="24"/>
-          <w:szCs w:val="24"/>
-        </w:rPr>
-        <w:t>:</w:t>
-      </w:r>
-      <w:proofErr w:type="gramEnd"/>
-      <w:r>
-        <w:rPr>
-          <w:rFonts w:ascii="Arial" w:eastAsia="Arial" w:hAnsi="Arial" w:cs="Arial"/>
-          <w:color w:val="000000" w:themeColor="text1"/>
-          <w:sz w:val="24"/>
-          <w:szCs w:val="24"/>
-        </w:rPr>
-        <w:t xml:space="preserve"> Celular</w:t>
+        <w:t xml:space="preserve">Análise de Qualidade </w:t>
+      </w:r>
+      <w:r>
+        <w:rPr>
+          <w:rFonts w:ascii="Arial" w:eastAsia="Arial" w:hAnsi="Arial" w:cs="Arial"/>
+          <w:color w:val="000000" w:themeColor="text1"/>
+          <w:sz w:val="24"/>
+          <w:szCs w:val="24"/>
+        </w:rPr>
+        <w:t>: Celular</w:t>
       </w:r>
     </w:p>
     <w:p>
@@ -600,19 +560,8 @@
           <w:sz w:val="24"/>
           <w:szCs w:val="24"/>
         </w:rPr>
-        <w:t xml:space="preserve">Testaremos se o celular seria para alguém com ou sem experiencia e se o Design é apropriado para fácil </w:t>
-      </w:r>
-      <w:proofErr w:type="gramStart"/>
-      <w:r>
-        <w:rPr>
-          <w:rFonts w:ascii="Arial" w:hAnsi="Arial" w:cs="Arial"/>
-          <w:color w:val="000000" w:themeColor="text1"/>
-          <w:sz w:val="24"/>
-          <w:szCs w:val="24"/>
-        </w:rPr>
-        <w:t>manejo .</w:t>
-      </w:r>
-      <w:proofErr w:type="gramEnd"/>
+        <w:t>Testaremos se o celular seria para alguém com ou sem experiencia e se o Design é apropriado para fácil manejo .</w:t>
+      </w:r>
       <w:r>
         <w:rPr>
           <w:rFonts w:ascii="Arial" w:hAnsi="Arial" w:cs="Arial"/>
@@ -1910,19 +1859,8 @@
           <w:sz w:val="24"/>
           <w:szCs w:val="24"/>
         </w:rPr>
-        <w:t xml:space="preserve">Trataremos das falhas e melhorias do Samsung s20, visando achar pontos negativo e positivos, O meu uso do Samsung por dois me deu percepção de um celular intermediário que precisa de um design que facilita o manejo e que tenha mais durabilidade de sistemas, qual o uso mostrou falhas em jogos e lentidão em alguns app, visando a melhoria de aparelhos no </w:t>
-      </w:r>
-      <w:proofErr w:type="gramStart"/>
-      <w:r>
-        <w:rPr>
-          <w:rFonts w:ascii="Arial" w:eastAsia="Arial" w:hAnsi="Arial" w:cs="Arial"/>
-          <w:color w:val="000000" w:themeColor="text1"/>
-          <w:sz w:val="24"/>
-          <w:szCs w:val="24"/>
-        </w:rPr>
-        <w:t>futuro .</w:t>
-      </w:r>
-      <w:proofErr w:type="gramEnd"/>
+        <w:t>Trataremos das falhas e melhorias do Samsung s20, visando achar pontos negativo e positivos, O meu uso do Samsung por dois me deu percepção de um celular intermediário que precisa de um design que facilita o manejo e que tenha mais durabilidade de sistemas, qual o uso mostrou falhas em jogos e lentidão em alguns app, visando a melhoria de aparelhos no futuro .</w:t>
+      </w:r>
     </w:p>
     <w:p>
       <w:pPr>
@@ -3110,42 +3048,8 @@
                 <w:sz w:val="24"/>
                 <w:szCs w:val="24"/>
               </w:rPr>
-              <w:t xml:space="preserve">Design bonito </w:t>
+              <w:t>Design bonito porem muito liso a pegada da mão, poderia ter mais aderência .</w:t>
             </w:r>
-            <w:proofErr w:type="gramStart"/>
-            <w:r>
-              <w:rPr>
-                <w:rFonts w:ascii="Arial" w:eastAsia="Arial" w:hAnsi="Arial" w:cs="Arial"/>
-                <w:bCs/>
-                <w:color w:val="000000" w:themeColor="text1"/>
-                <w:sz w:val="24"/>
-                <w:szCs w:val="24"/>
-              </w:rPr>
-              <w:t>porem</w:t>
-            </w:r>
-            <w:proofErr w:type="gramEnd"/>
-            <w:r>
-              <w:rPr>
-                <w:rFonts w:ascii="Arial" w:eastAsia="Arial" w:hAnsi="Arial" w:cs="Arial"/>
-                <w:bCs/>
-                <w:color w:val="000000" w:themeColor="text1"/>
-                <w:sz w:val="24"/>
-                <w:szCs w:val="24"/>
-              </w:rPr>
-              <w:t xml:space="preserve"> muito liso a pegada da mão, poderia ter mais </w:t>
-            </w:r>
-            <w:proofErr w:type="gramStart"/>
-            <w:r>
-              <w:rPr>
-                <w:rFonts w:ascii="Arial" w:eastAsia="Arial" w:hAnsi="Arial" w:cs="Arial"/>
-                <w:bCs/>
-                <w:color w:val="000000" w:themeColor="text1"/>
-                <w:sz w:val="24"/>
-                <w:szCs w:val="24"/>
-              </w:rPr>
-              <w:t>aderência .</w:t>
-            </w:r>
-            <w:proofErr w:type="gramEnd"/>
           </w:p>
         </w:tc>
         <w:tc>
@@ -3172,20 +3076,8 @@
                 <w:sz w:val="24"/>
                 <w:szCs w:val="24"/>
               </w:rPr>
-              <w:t xml:space="preserve">Ex. </w:t>
+              <w:t>Ex. Im</w:t>
             </w:r>
-            <w:proofErr w:type="spellStart"/>
-            <w:r>
-              <w:rPr>
-                <w:rFonts w:ascii="Arial" w:eastAsia="Arial" w:hAnsi="Arial" w:cs="Arial"/>
-                <w:bCs/>
-                <w:color w:val="000000" w:themeColor="text1"/>
-                <w:sz w:val="24"/>
-                <w:szCs w:val="24"/>
-              </w:rPr>
-              <w:t>Im</w:t>
-            </w:r>
-            <w:proofErr w:type="spellEnd"/>
             <w:r>
               <w:rPr>
                 <w:noProof/>
@@ -3456,36 +3348,16 @@
           <w:sz w:val="24"/>
           <w:szCs w:val="24"/>
         </w:rPr>
-        <w:t xml:space="preserve">O item </w:t>
-      </w:r>
-      <w:proofErr w:type="gramStart"/>
-      <w:r>
-        <w:rPr>
-          <w:rFonts w:ascii="Arial" w:eastAsia="Arial" w:hAnsi="Arial" w:cs="Arial"/>
-          <w:color w:val="000000" w:themeColor="text1"/>
-          <w:sz w:val="24"/>
-          <w:szCs w:val="24"/>
-        </w:rPr>
-        <w:t>analisado</w:t>
-      </w:r>
-      <w:r>
-        <w:rPr>
-          <w:rFonts w:ascii="Arial" w:eastAsia="Arial" w:hAnsi="Arial" w:cs="Arial"/>
-          <w:color w:val="000000" w:themeColor="text1"/>
-          <w:sz w:val="24"/>
-          <w:szCs w:val="24"/>
-        </w:rPr>
-        <w:t xml:space="preserve"> :</w:t>
-      </w:r>
-      <w:proofErr w:type="gramEnd"/>
-      <w:r>
-        <w:rPr>
-          <w:rFonts w:ascii="Arial" w:eastAsia="Arial" w:hAnsi="Arial" w:cs="Arial"/>
-          <w:color w:val="000000" w:themeColor="text1"/>
-          <w:sz w:val="24"/>
-          <w:szCs w:val="24"/>
-        </w:rPr>
-        <w:t xml:space="preserve"> Samsung s20</w:t>
+        <w:t>O item analisado</w:t>
+      </w:r>
+      <w:r>
+        <w:rPr>
+          <w:rFonts w:ascii="Arial" w:eastAsia="Arial" w:hAnsi="Arial" w:cs="Arial"/>
+          <w:color w:val="000000" w:themeColor="text1"/>
+          <w:sz w:val="24"/>
+          <w:szCs w:val="24"/>
+        </w:rPr>
+        <w:t xml:space="preserve"> : Samsung s20</w:t>
       </w:r>
     </w:p>
     <w:p>
@@ -3537,27 +3409,7 @@
           <w:sz w:val="24"/>
           <w:szCs w:val="24"/>
         </w:rPr>
-        <w:t xml:space="preserve">Minha </w:t>
-      </w:r>
-      <w:proofErr w:type="spellStart"/>
-      <w:r>
-        <w:rPr>
-          <w:rFonts w:ascii="Arial" w:eastAsia="Arial" w:hAnsi="Arial" w:cs="Arial"/>
-          <w:color w:val="000000" w:themeColor="text1"/>
-          <w:sz w:val="24"/>
-          <w:szCs w:val="24"/>
-        </w:rPr>
-        <w:t>finha</w:t>
-      </w:r>
-      <w:proofErr w:type="spellEnd"/>
-      <w:r>
-        <w:rPr>
-          <w:rFonts w:ascii="Arial" w:eastAsia="Arial" w:hAnsi="Arial" w:cs="Arial"/>
-          <w:color w:val="000000" w:themeColor="text1"/>
-          <w:sz w:val="24"/>
-          <w:szCs w:val="24"/>
-        </w:rPr>
-        <w:t xml:space="preserve"> de 9 anos utiliza junto comigo o celular </w:t>
+        <w:t xml:space="preserve">Minha finha de 9 anos utiliza junto comigo o celular </w:t>
       </w:r>
     </w:p>
     <w:p>
@@ -3592,19 +3444,8 @@
           <w:sz w:val="24"/>
           <w:szCs w:val="24"/>
         </w:rPr>
-        <w:t xml:space="preserve">Design liso crianças derrubariam com </w:t>
-      </w:r>
-      <w:proofErr w:type="gramStart"/>
-      <w:r>
-        <w:rPr>
-          <w:rFonts w:ascii="Arial" w:eastAsia="Arial" w:hAnsi="Arial" w:cs="Arial"/>
-          <w:color w:val="000000" w:themeColor="text1"/>
-          <w:sz w:val="24"/>
-          <w:szCs w:val="24"/>
-        </w:rPr>
-        <w:t>facilidade .</w:t>
-      </w:r>
-      <w:proofErr w:type="gramEnd"/>
+        <w:t>Design liso crianças derrubariam com facilidade .</w:t>
+      </w:r>
     </w:p>
     <w:p>
       <w:pPr>
@@ -3877,30 +3718,14 @@
           <w:rFonts w:ascii="Arial" w:hAnsi="Arial" w:cs="Arial"/>
           <w:color w:val="000000" w:themeColor="text1"/>
         </w:rPr>
-        <w:t xml:space="preserve">Imagem 2: </w:t>
-      </w:r>
-      <w:proofErr w:type="gramStart"/>
+        <w:t xml:space="preserve">Imagem 2: Foto </w:t>
+      </w:r>
       <w:r>
         <w:rPr>
           <w:rFonts w:ascii="Arial" w:hAnsi="Arial" w:cs="Arial"/>
           <w:color w:val="000000" w:themeColor="text1"/>
         </w:rPr>
-        <w:t xml:space="preserve">Foto </w:t>
-      </w:r>
-      <w:r>
-        <w:rPr>
-          <w:rFonts w:ascii="Arial" w:hAnsi="Arial" w:cs="Arial"/>
-          <w:color w:val="000000" w:themeColor="text1"/>
-        </w:rPr>
-        <w:t>celular</w:t>
-      </w:r>
-      <w:proofErr w:type="gramEnd"/>
-      <w:r>
-        <w:rPr>
-          <w:rFonts w:ascii="Arial" w:hAnsi="Arial" w:cs="Arial"/>
-          <w:color w:val="000000" w:themeColor="text1"/>
-        </w:rPr>
-        <w:t xml:space="preserve"> </w:t>
+        <w:t xml:space="preserve">celular </w:t>
       </w:r>
     </w:p>
     <w:p>
@@ -3951,47 +3776,7 @@
             <w:sz w:val="24"/>
             <w:szCs w:val="24"/>
           </w:rPr>
-          <w:t xml:space="preserve">Smartphone Samsung Galaxy S20 Fe </w:t>
-        </w:r>
-        <w:proofErr w:type="spellStart"/>
-        <w:r>
-          <w:rPr>
-            <w:rStyle w:val="Hyperlink"/>
-            <w:rFonts w:ascii="Arial" w:hAnsi="Arial" w:cs="Arial"/>
-            <w:sz w:val="24"/>
-            <w:szCs w:val="24"/>
-          </w:rPr>
-          <w:t>Tl</w:t>
-        </w:r>
-        <w:proofErr w:type="spellEnd"/>
-        <w:r>
-          <w:rPr>
-            <w:rStyle w:val="Hyperlink"/>
-            <w:rFonts w:ascii="Arial" w:hAnsi="Arial" w:cs="Arial"/>
-            <w:sz w:val="24"/>
-            <w:szCs w:val="24"/>
-          </w:rPr>
-          <w:t xml:space="preserve"> 6.5 128gb 6gb </w:t>
-        </w:r>
-        <w:proofErr w:type="spellStart"/>
-        <w:r>
-          <w:rPr>
-            <w:rStyle w:val="Hyperlink"/>
-            <w:rFonts w:ascii="Arial" w:hAnsi="Arial" w:cs="Arial"/>
-            <w:sz w:val="24"/>
-            <w:szCs w:val="24"/>
-          </w:rPr>
-          <w:t>Ram</w:t>
-        </w:r>
-        <w:proofErr w:type="spellEnd"/>
-        <w:r>
-          <w:rPr>
-            <w:rStyle w:val="Hyperlink"/>
-            <w:rFonts w:ascii="Arial" w:hAnsi="Arial" w:cs="Arial"/>
-            <w:sz w:val="24"/>
-            <w:szCs w:val="24"/>
-          </w:rPr>
-          <w:t xml:space="preserve"> Branco | Parcelamento sem juros</w:t>
+          <w:t>Smartphone Samsung Galaxy S20 Fe Tl 6.5 128gb 6gb Ram Branco | Parcelamento sem juros</w:t>
         </w:r>
       </w:hyperlink>
     </w:p>
@@ -4035,126 +3820,7 @@
           <w:sz w:val="24"/>
           <w:szCs w:val="24"/>
         </w:rPr>
-        <w:t xml:space="preserve">Coloque sua experiência na realização do trabalho, o que aprendeu, quais lições pode aplicar </w:t>
-      </w:r>
-      <w:r>
-        <w:rPr>
-          <w:rFonts w:ascii="Arial" w:eastAsia="Arial" w:hAnsi="Arial" w:cs="Arial"/>
-          <w:color w:val="000000" w:themeColor="text1"/>
-          <w:sz w:val="24"/>
-          <w:szCs w:val="24"/>
-        </w:rPr>
-        <w:t>em sua</w:t>
-      </w:r>
-      <w:r>
-        <w:rPr>
-          <w:rFonts w:ascii="Arial" w:eastAsia="Arial" w:hAnsi="Arial" w:cs="Arial"/>
-          <w:color w:val="000000" w:themeColor="text1"/>
-          <w:sz w:val="24"/>
-          <w:szCs w:val="24"/>
-        </w:rPr>
-        <w:t xml:space="preserve"> vida pr</w:t>
-      </w:r>
-      <w:r>
-        <w:rPr>
-          <w:rFonts w:ascii="Arial" w:eastAsia="Arial" w:hAnsi="Arial" w:cs="Arial"/>
-          <w:color w:val="000000" w:themeColor="text1"/>
-          <w:sz w:val="24"/>
-          <w:szCs w:val="24"/>
-        </w:rPr>
-        <w:t>o</w:t>
-      </w:r>
-      <w:r>
-        <w:rPr>
-          <w:rFonts w:ascii="Arial" w:eastAsia="Arial" w:hAnsi="Arial" w:cs="Arial"/>
-          <w:color w:val="000000" w:themeColor="text1"/>
-          <w:sz w:val="24"/>
-          <w:szCs w:val="24"/>
-        </w:rPr>
-        <w:t xml:space="preserve">fissional etc. </w:t>
-      </w:r>
-    </w:p>
-    <w:p>
-      <w:pPr>
-        <w:spacing w:line="360" w:lineRule="auto"/>
-        <w:jc w:val="both"/>
-        <w:rPr>
-          <w:rFonts w:ascii="Arial" w:eastAsia="Arial" w:hAnsi="Arial" w:cs="Arial"/>
-          <w:color w:val="000000" w:themeColor="text1"/>
-          <w:sz w:val="24"/>
-          <w:szCs w:val="24"/>
-        </w:rPr>
-      </w:pPr>
-      <w:r>
-        <w:rPr>
-          <w:rFonts w:ascii="Arial" w:eastAsia="Arial" w:hAnsi="Arial" w:cs="Arial"/>
-          <w:color w:val="000000" w:themeColor="text1"/>
-          <w:sz w:val="24"/>
-          <w:szCs w:val="24"/>
-        </w:rPr>
-        <w:t xml:space="preserve">Uma boa </w:t>
-      </w:r>
-      <w:proofErr w:type="gramStart"/>
-      <w:r>
-        <w:rPr>
-          <w:rFonts w:ascii="Arial" w:eastAsia="Arial" w:hAnsi="Arial" w:cs="Arial"/>
-          <w:color w:val="000000" w:themeColor="text1"/>
-          <w:sz w:val="24"/>
-          <w:szCs w:val="24"/>
-        </w:rPr>
-        <w:t>analise</w:t>
-      </w:r>
-      <w:proofErr w:type="gramEnd"/>
-      <w:r>
-        <w:rPr>
-          <w:rFonts w:ascii="Arial" w:eastAsia="Arial" w:hAnsi="Arial" w:cs="Arial"/>
-          <w:color w:val="000000" w:themeColor="text1"/>
-          <w:sz w:val="24"/>
-          <w:szCs w:val="24"/>
-        </w:rPr>
-        <w:t xml:space="preserve">, desenvolvendo melhorias e aprendi que tudo que é bom pode </w:t>
-      </w:r>
-      <w:proofErr w:type="gramStart"/>
-      <w:r>
-        <w:rPr>
-          <w:rFonts w:ascii="Arial" w:eastAsia="Arial" w:hAnsi="Arial" w:cs="Arial"/>
-          <w:color w:val="000000" w:themeColor="text1"/>
-          <w:sz w:val="24"/>
-          <w:szCs w:val="24"/>
-        </w:rPr>
-        <w:t>melhorar ,com</w:t>
-      </w:r>
-      <w:proofErr w:type="gramEnd"/>
-      <w:r>
-        <w:rPr>
-          <w:rFonts w:ascii="Arial" w:eastAsia="Arial" w:hAnsi="Arial" w:cs="Arial"/>
-          <w:color w:val="000000" w:themeColor="text1"/>
-          <w:sz w:val="24"/>
-          <w:szCs w:val="24"/>
-        </w:rPr>
-        <w:t xml:space="preserve"> a </w:t>
-      </w:r>
-      <w:proofErr w:type="spellStart"/>
-      <w:proofErr w:type="gramStart"/>
-      <w:r>
-        <w:rPr>
-          <w:rFonts w:ascii="Arial" w:eastAsia="Arial" w:hAnsi="Arial" w:cs="Arial"/>
-          <w:color w:val="000000" w:themeColor="text1"/>
-          <w:sz w:val="24"/>
-          <w:szCs w:val="24"/>
-        </w:rPr>
-        <w:t>analise</w:t>
-      </w:r>
-      <w:proofErr w:type="spellEnd"/>
-      <w:proofErr w:type="gramEnd"/>
-      <w:r>
-        <w:rPr>
-          <w:rFonts w:ascii="Arial" w:eastAsia="Arial" w:hAnsi="Arial" w:cs="Arial"/>
-          <w:color w:val="000000" w:themeColor="text1"/>
-          <w:sz w:val="24"/>
-          <w:szCs w:val="24"/>
-        </w:rPr>
-        <w:t xml:space="preserve"> do celular Samsung me fez pensar que nada e perfeito e que sempre poso estar em crescimento </w:t>
+        <w:t xml:space="preserve">Uma boa analise, desenvolvendo melhorias e aprendi que tudo que é bom pode melhorar ,com a analise do celular Samsung me fez pensar que nada e perfeito e que sempre poso estar em crescimento </w:t>
       </w:r>
     </w:p>
     <w:p>
@@ -4202,7 +3868,6 @@
           <w:szCs w:val="24"/>
           <w:highlight w:val="yellow"/>
         </w:rPr>
-        <w:lastRenderedPageBreak/>
         <w:t>Seguir regras ABNT</w:t>
       </w:r>
       <w:r>

</xml_diff>